<commit_message>
invoice, and report upddate
</commit_message>
<xml_diff>
--- a/project/Project Report.docx
+++ b/project/Project Report.docx
@@ -34,49 +34,8 @@
           <w:sz w:val="24"/>
           <w:szCs w:val="24"/>
         </w:rPr>
-        <w:t xml:space="preserve">Artjom </w:t>
-      </w:r>
-      <w:proofErr w:type="spellStart"/>
-      <w:r>
-        <w:rPr>
-          <w:sz w:val="24"/>
-          <w:szCs w:val="24"/>
-        </w:rPr>
-        <w:t>Smorgulenko</w:t>
-      </w:r>
-      <w:proofErr w:type="spellEnd"/>
-      <w:r>
-        <w:rPr>
-          <w:sz w:val="24"/>
-          <w:szCs w:val="24"/>
-        </w:rPr>
-        <w:t xml:space="preserve">, Samuel Pasierb, </w:t>
-      </w:r>
-      <w:proofErr w:type="spellStart"/>
-      <w:r>
-        <w:rPr>
-          <w:sz w:val="24"/>
-          <w:szCs w:val="24"/>
-        </w:rPr>
-        <w:t>Shuvojyoti</w:t>
-      </w:r>
-      <w:proofErr w:type="spellEnd"/>
-      <w:r>
-        <w:rPr>
-          <w:sz w:val="24"/>
-          <w:szCs w:val="24"/>
-        </w:rPr>
-        <w:t xml:space="preserve"> Singha, Kaan </w:t>
-      </w:r>
-      <w:proofErr w:type="spellStart"/>
-      <w:r>
-        <w:rPr>
-          <w:sz w:val="24"/>
-          <w:szCs w:val="24"/>
-        </w:rPr>
-        <w:t>Özkilic</w:t>
-      </w:r>
-      <w:proofErr w:type="spellEnd"/>
+        <w:t>Artjom Smorgulenko, Samuel Pasierb, Shuvojyoti Singha, Kaan Özkilic</w:t>
+      </w:r>
     </w:p>
     <w:p>
       <w:pPr>
@@ -87,98 +46,30 @@
       <w:pPr>
         <w:pStyle w:val="Heading2"/>
       </w:pPr>
-      <w:proofErr w:type="spellStart"/>
-      <w:r>
-        <w:t>Analyzing</w:t>
-      </w:r>
-      <w:proofErr w:type="spellEnd"/>
-      <w:r>
-        <w:t xml:space="preserve"> </w:t>
-      </w:r>
-      <w:proofErr w:type="spellStart"/>
-      <w:r>
-        <w:t>CompanyLtd</w:t>
-      </w:r>
-      <w:proofErr w:type="spellEnd"/>
-      <w:r>
-        <w:t xml:space="preserve"> data</w:t>
-      </w:r>
-    </w:p>
-    <w:p>
-      <w:r>
-        <w:t>1. Restored the .</w:t>
-      </w:r>
-      <w:proofErr w:type="spellStart"/>
-      <w:r>
-        <w:t>bak</w:t>
-      </w:r>
-      <w:proofErr w:type="spellEnd"/>
-      <w:r>
-        <w:t xml:space="preserve"> database and loaded it into </w:t>
-      </w:r>
-      <w:proofErr w:type="spellStart"/>
-      <w:r>
-        <w:t>CompanyLtd</w:t>
-      </w:r>
-      <w:proofErr w:type="spellEnd"/>
-      <w:r>
-        <w:t>.</w:t>
-      </w:r>
-    </w:p>
-    <w:p>
-      <w:r>
-        <w:t xml:space="preserve">2. Created the </w:t>
-      </w:r>
-      <w:proofErr w:type="spellStart"/>
-      <w:r>
-        <w:t>Staging</w:t>
-      </w:r>
-      <w:r>
-        <w:t>D</w:t>
-      </w:r>
-      <w:r>
-        <w:t>atabase</w:t>
-      </w:r>
-      <w:proofErr w:type="spellEnd"/>
-      <w:r>
-        <w:t xml:space="preserve"> using the </w:t>
-      </w:r>
-      <w:r>
-        <w:t xml:space="preserve">course </w:t>
-      </w:r>
-      <w:r>
-        <w:t>file.</w:t>
-      </w:r>
-    </w:p>
-    <w:p>
-      <w:r>
-        <w:t xml:space="preserve">3. Imported data from </w:t>
-      </w:r>
-      <w:proofErr w:type="spellStart"/>
-      <w:r>
-        <w:t>CompanyLtd</w:t>
-      </w:r>
-      <w:proofErr w:type="spellEnd"/>
-      <w:r>
-        <w:t xml:space="preserve"> to </w:t>
-      </w:r>
-      <w:proofErr w:type="spellStart"/>
-      <w:r>
-        <w:t>Staging</w:t>
-      </w:r>
-      <w:r>
-        <w:t>Database</w:t>
-      </w:r>
-      <w:proofErr w:type="spellEnd"/>
-      <w:r>
-        <w:t xml:space="preserve"> for each table required</w:t>
-      </w:r>
-      <w:r>
-        <w:t>.</w:t>
-      </w:r>
-    </w:p>
-    <w:p>
-      <w:r>
+      <w:r>
+        <w:t>Analyzing CompanyLtd data</w:t>
+      </w:r>
+    </w:p>
+    <w:p>
+      <w:r>
+        <w:t>1. Restored the .bak database and loaded it into CompanyLtd.</w:t>
+      </w:r>
+    </w:p>
+    <w:p>
+      <w:r>
+        <w:t>2. Created the StagingDatabase using the course file.</w:t>
+      </w:r>
+    </w:p>
+    <w:p>
+      <w:r>
+        <w:t>3. Imported data from CompanyLtd to StagingDatabase for each table required.</w:t>
+      </w:r>
+    </w:p>
+    <w:p>
+      <w:r>
+        <w:rPr>
+          <w:noProof/>
+        </w:rPr>
         <w:drawing>
           <wp:inline distT="0" distB="0" distL="0" distR="0" wp14:anchorId="0370EC55" wp14:editId="7AE7AB0E">
             <wp:extent cx="4940300" cy="1661180"/>
@@ -242,6 +133,9 @@
     </w:p>
     <w:p>
       <w:r>
+        <w:rPr>
+          <w:noProof/>
+        </w:rPr>
         <w:drawing>
           <wp:inline distT="0" distB="0" distL="0" distR="0" wp14:anchorId="73275820" wp14:editId="473A9BC7">
             <wp:extent cx="5334000" cy="808433"/>
@@ -281,15 +175,7 @@
     </w:p>
     <w:p>
       <w:r>
-        <w:t xml:space="preserve">First 2 rows of the source file </w:t>
-      </w:r>
-      <w:proofErr w:type="gramStart"/>
-      <w:r>
-        <w:t>was</w:t>
-      </w:r>
-      <w:proofErr w:type="gramEnd"/>
-      <w:r>
-        <w:t xml:space="preserve"> skipped for usability.</w:t>
+        <w:t>First 2 rows of the source file was skipped for usability.</w:t>
       </w:r>
     </w:p>
     <w:p>
@@ -299,6 +185,9 @@
     </w:p>
     <w:p>
       <w:r>
+        <w:rPr>
+          <w:noProof/>
+        </w:rPr>
         <w:lastRenderedPageBreak/>
         <w:drawing>
           <wp:inline distT="0" distB="0" distL="0" distR="0" wp14:anchorId="50506D5F" wp14:editId="07B4E2DC">
@@ -352,70 +241,669 @@
     </w:p>
     <w:p>
       <w:r>
+        <w:t>and finally the data gathered is cleaned, the dates are formatted and invalid dates are removed.</w:t>
+      </w:r>
+    </w:p>
+    <w:p/>
+    <w:p>
+      <w:r>
+        <w:t>[DATABASE RELATIONSHIP PIC]</w:t>
+      </w:r>
+    </w:p>
+    <w:p/>
+    <w:p>
+      <w:pPr>
+        <w:pStyle w:val="Heading2"/>
+        <w:rPr>
+          <w:lang w:val="en-US"/>
+        </w:rPr>
+      </w:pPr>
+      <w:r>
+        <w:t>Invoice – cont</w:t>
+      </w:r>
+      <w:r>
+        <w:rPr>
+          <w:lang w:val="en-US"/>
+        </w:rPr>
+        <w:t>r</w:t>
+      </w:r>
+      <w:r>
+        <w:t>act stuff</w:t>
+      </w:r>
+    </w:p>
+    <w:p>
+      <w:pPr>
+        <w:pStyle w:val="NormalWeb"/>
+        <w:numPr>
+          <w:ilvl w:val="0"/>
+          <w:numId w:val="4"/>
+        </w:numPr>
+        <w:rPr>
+          <w:rFonts w:asciiTheme="minorHAnsi" w:hAnsiTheme="minorHAnsi"/>
+        </w:rPr>
+      </w:pPr>
+      <w:r>
+        <w:rPr>
+          <w:rFonts w:asciiTheme="minorHAnsi" w:hAnsiTheme="minorHAnsi"/>
+        </w:rPr>
+        <w:t xml:space="preserve">To build the invoice facts for reporting, the provided stored </w:t>
+      </w:r>
+      <w:r>
+        <w:rPr>
+          <w:rFonts w:asciiTheme="minorHAnsi" w:hAnsiTheme="minorHAnsi"/>
+          <w:lang w:val="en-US"/>
+        </w:rPr>
+        <w:t xml:space="preserve">invoice </w:t>
+      </w:r>
+      <w:r>
+        <w:rPr>
+          <w:rFonts w:asciiTheme="minorHAnsi" w:hAnsiTheme="minorHAnsi"/>
+        </w:rPr>
+        <w:t xml:space="preserve">procedures </w:t>
+      </w:r>
+      <w:r>
+        <w:rPr>
+          <w:rFonts w:asciiTheme="minorHAnsi" w:hAnsiTheme="minorHAnsi"/>
+          <w:lang w:val="en-US"/>
+        </w:rPr>
+        <w:t xml:space="preserve">in </w:t>
+      </w:r>
+      <w:r>
+        <w:rPr>
+          <w:rFonts w:asciiTheme="minorHAnsi" w:hAnsiTheme="minorHAnsi"/>
+          <w:lang w:val="en-US"/>
+        </w:rPr>
+        <w:t>Moodle</w:t>
+      </w:r>
+      <w:r>
+        <w:rPr>
+          <w:rFonts w:asciiTheme="minorHAnsi" w:hAnsiTheme="minorHAnsi"/>
+          <w:lang w:val="en-US"/>
+        </w:rPr>
+        <w:t xml:space="preserve"> </w:t>
+      </w:r>
+      <w:r>
+        <w:rPr>
+          <w:rFonts w:asciiTheme="minorHAnsi" w:hAnsiTheme="minorHAnsi"/>
+        </w:rPr>
+        <w:t xml:space="preserve">were executed in the </w:t>
+      </w:r>
+      <w:r>
+        <w:rPr>
+          <w:rStyle w:val="Strong"/>
+          <w:rFonts w:asciiTheme="minorHAnsi" w:eastAsiaTheme="majorEastAsia" w:hAnsiTheme="minorHAnsi"/>
+        </w:rPr>
+        <w:t>StagingDatabase</w:t>
+      </w:r>
+      <w:r>
+        <w:rPr>
+          <w:rFonts w:asciiTheme="minorHAnsi" w:hAnsiTheme="minorHAnsi"/>
+        </w:rPr>
+        <w:t>:</w:t>
+      </w:r>
+    </w:p>
+    <w:p>
+      <w:pPr>
+        <w:pStyle w:val="NormalWeb"/>
+        <w:ind w:left="360"/>
+        <w:rPr>
+          <w:rFonts w:asciiTheme="minorHAnsi" w:hAnsiTheme="minorHAnsi"/>
+        </w:rPr>
+      </w:pPr>
+    </w:p>
+    <w:p>
+      <w:pPr>
+        <w:pStyle w:val="ListParagraph"/>
+        <w:numPr>
+          <w:ilvl w:val="0"/>
+          <w:numId w:val="4"/>
+        </w:numPr>
+      </w:pPr>
+      <w:r>
+        <w:rPr>
+          <w:lang w:val="en-US"/>
+        </w:rPr>
+        <w:t xml:space="preserve">The procedures </w:t>
+      </w:r>
+      <w:r>
+        <w:t xml:space="preserve">read </w:t>
+      </w:r>
+      <w:r>
+        <w:rPr>
+          <w:lang w:val="en-US"/>
+        </w:rPr>
+        <w:t xml:space="preserve">the cleaned tables </w:t>
+      </w:r>
+      <w:r>
+        <w:t xml:space="preserve">(extractedContract, extractedCustomer, extractedPrices) </w:t>
+      </w:r>
+      <w:r>
+        <w:rPr>
+          <w:lang w:val="en-US"/>
+        </w:rPr>
+        <w:t xml:space="preserve">and calculate invoice headers, rows, among cost and margin per contact row, </w:t>
+      </w:r>
+      <w:r>
         <w:t xml:space="preserve">and </w:t>
       </w:r>
+      <w:r>
+        <w:rPr>
+          <w:lang w:val="en-US"/>
+        </w:rPr>
+        <w:t>load</w:t>
+      </w:r>
+      <w:r>
+        <w:rPr>
+          <w:lang w:val="en-US"/>
+        </w:rPr>
+        <w:t xml:space="preserve"> the results into</w:t>
+      </w:r>
+      <w:r>
+        <w:t xml:space="preserve"> RepositoryDW tables:</w:t>
+      </w:r>
+    </w:p>
+    <w:p>
+      <w:pPr>
+        <w:pStyle w:val="ListParagraph"/>
+        <w:numPr>
+          <w:ilvl w:val="1"/>
+          <w:numId w:val="5"/>
+        </w:numPr>
+      </w:pPr>
+      <w:r>
+        <w:t>FactInvoiceHeader (invoicenumber, customer_id, invoicedate, duedate)</w:t>
+      </w:r>
+    </w:p>
+    <w:p>
+      <w:pPr>
+        <w:pStyle w:val="ListParagraph"/>
+        <w:numPr>
+          <w:ilvl w:val="1"/>
+          <w:numId w:val="5"/>
+        </w:numPr>
+      </w:pPr>
+      <w:r>
+        <w:t>FactInvoicesRow (invoicenumber, rownumber, contract_id, contracttype_id, amount, cost)</w:t>
+      </w:r>
+    </w:p>
+    <w:p>
+      <w:pPr>
+        <w:pStyle w:val="ListParagraph"/>
+        <w:ind w:left="1440"/>
+      </w:pPr>
+    </w:p>
+    <w:p>
+      <w:pPr>
+        <w:pStyle w:val="ListParagraph"/>
+        <w:numPr>
+          <w:ilvl w:val="0"/>
+          <w:numId w:val="7"/>
+        </w:numPr>
+        <w:rPr>
+          <w:lang w:val="en-US"/>
+        </w:rPr>
+      </w:pPr>
+      <w:r>
+        <w:rPr>
+          <w:lang w:val="en-US"/>
+        </w:rPr>
+        <w:t>For this project we gathered invoices from 2021 with:</w:t>
+      </w:r>
+    </w:p>
+    <w:p>
+      <w:pPr>
+        <w:pStyle w:val="ListParagraph"/>
+        <w:rPr>
+          <w:lang w:val="en-US"/>
+        </w:rPr>
+      </w:pPr>
+      <w:r>
+        <w:rPr>
+          <w:lang w:val="en-US"/>
+        </w:rPr>
+        <w:t xml:space="preserve">EXEC </w:t>
+      </w:r>
+      <w:proofErr w:type="spellStart"/>
       <w:proofErr w:type="gramStart"/>
       <w:r>
-        <w:t>finally</w:t>
-      </w:r>
+        <w:rPr>
+          <w:lang w:val="en-US"/>
+        </w:rPr>
+        <w:t>dbo.createInvoiceDataForYear</w:t>
+      </w:r>
+      <w:proofErr w:type="spellEnd"/>
       <w:proofErr w:type="gramEnd"/>
       <w:r>
-        <w:t xml:space="preserve"> the data gathered is cleaned, the dates are </w:t>
+        <w:rPr>
+          <w:lang w:val="en-US"/>
+        </w:rPr>
+        <w:t xml:space="preserve"> @year_value = </w:t>
       </w:r>
       <w:proofErr w:type="gramStart"/>
       <w:r>
-        <w:t>formatted</w:t>
+        <w:rPr>
+          <w:lang w:val="en-US"/>
+        </w:rPr>
+        <w:t>2021;</w:t>
       </w:r>
       <w:proofErr w:type="gramEnd"/>
-      <w:r>
-        <w:t xml:space="preserve"> and invalid dates are removed.</w:t>
-      </w:r>
-    </w:p>
-    <w:p/>
-    <w:p>
-      <w:r>
-        <w:t>[DATABASE RELATIONSHIP PIC]</w:t>
-      </w:r>
-    </w:p>
-    <w:p/>
-    <w:p>
-      <w:pPr>
-        <w:pStyle w:val="Heading2"/>
-      </w:pPr>
-      <w:r>
-        <w:t>Invoice – contract stuff</w:t>
-      </w:r>
-    </w:p>
-    <w:p>
-      <w:pPr>
-        <w:pStyle w:val="Heading2"/>
-      </w:pPr>
+    </w:p>
+    <w:p>
+      <w:pPr>
+        <w:pStyle w:val="ListParagraph"/>
+        <w:rPr>
+          <w:lang w:val="en-US"/>
+        </w:rPr>
+      </w:pPr>
+      <w:r>
+        <w:t>This created all invoice headers and rows for every active customer/contract during 2021.</w:t>
+      </w:r>
+    </w:p>
+    <w:p>
+      <w:pPr>
+        <w:pStyle w:val="ListParagraph"/>
+        <w:rPr>
+          <w:lang w:val="en-US"/>
+        </w:rPr>
+      </w:pPr>
+    </w:p>
+    <w:p>
+      <w:pPr>
+        <w:pStyle w:val="ListParagraph"/>
+        <w:numPr>
+          <w:ilvl w:val="0"/>
+          <w:numId w:val="7"/>
+        </w:numPr>
+        <w:rPr>
+          <w:lang w:val="en-US"/>
+        </w:rPr>
+      </w:pPr>
+      <w:r>
+        <w:rPr>
+          <w:lang w:val="en-US"/>
+        </w:rPr>
+        <w:t>Verified loaded invoice data:</w:t>
+      </w:r>
+    </w:p>
+    <w:p>
+      <w:pPr>
+        <w:pStyle w:val="ListParagraph"/>
+        <w:rPr>
+          <w:lang w:val="en-US"/>
+        </w:rPr>
+      </w:pPr>
+      <w:r>
+        <w:rPr>
+          <w:lang w:val="en-US"/>
+        </w:rPr>
+        <w:t>Count of invoice header, count of invoice row, sample row of table.</w:t>
+      </w:r>
+    </w:p>
+    <w:p>
+      <w:pPr>
+        <w:pStyle w:val="ListParagraph"/>
+        <w:rPr>
+          <w:lang w:val="en-US"/>
+        </w:rPr>
+      </w:pPr>
+      <w:r>
+        <w:rPr>
+          <w:noProof/>
+          <w:lang w:val="en-US"/>
+        </w:rPr>
+        <w:drawing>
+          <wp:inline distT="0" distB="0" distL="0" distR="0" wp14:anchorId="6BF3AE6F" wp14:editId="59E74069">
+            <wp:extent cx="5731510" cy="2218690"/>
+            <wp:effectExtent l="0" t="0" r="2540" b="0"/>
+            <wp:docPr id="682936796" name="Picture 1" descr="A screenshot of a computer&#10;&#10;AI-generated content may be incorrect."/>
+            <wp:cNvGraphicFramePr>
+              <a:graphicFrameLocks xmlns:a="http://schemas.openxmlformats.org/drawingml/2006/main" noChangeAspect="1"/>
+            </wp:cNvGraphicFramePr>
+            <a:graphic xmlns:a="http://schemas.openxmlformats.org/drawingml/2006/main">
+              <a:graphicData uri="http://schemas.openxmlformats.org/drawingml/2006/picture">
+                <pic:pic xmlns:pic="http://schemas.openxmlformats.org/drawingml/2006/picture">
+                  <pic:nvPicPr>
+                    <pic:cNvPr id="682936796" name="Picture 1" descr="A screenshot of a computer&#10;&#10;AI-generated content may be incorrect."/>
+                    <pic:cNvPicPr/>
+                  </pic:nvPicPr>
+                  <pic:blipFill>
+                    <a:blip r:embed="rId8"/>
+                    <a:stretch>
+                      <a:fillRect/>
+                    </a:stretch>
+                  </pic:blipFill>
+                  <pic:spPr>
+                    <a:xfrm>
+                      <a:off x="0" y="0"/>
+                      <a:ext cx="5731510" cy="2218690"/>
+                    </a:xfrm>
+                    <a:prstGeom prst="rect">
+                      <a:avLst/>
+                    </a:prstGeom>
+                  </pic:spPr>
+                </pic:pic>
+              </a:graphicData>
+            </a:graphic>
+          </wp:inline>
+        </w:drawing>
+      </w:r>
+    </w:p>
+    <w:p>
+      <w:pPr>
+        <w:pStyle w:val="ListParagraph"/>
+        <w:numPr>
+          <w:ilvl w:val="0"/>
+          <w:numId w:val="7"/>
+        </w:numPr>
+        <w:rPr>
+          <w:lang w:val="en-US"/>
+        </w:rPr>
+      </w:pPr>
+      <w:r>
+        <w:t>Then the total per invoice was calculated</w:t>
+      </w:r>
+      <w:r>
+        <w:rPr>
+          <w:lang w:val="en-US"/>
+        </w:rPr>
+        <w:t>:</w:t>
+      </w:r>
+    </w:p>
+    <w:p>
+      <w:pPr>
+        <w:pStyle w:val="ListParagraph"/>
+        <w:rPr>
+          <w:lang w:val="en-US"/>
+        </w:rPr>
+      </w:pPr>
+      <w:r>
+        <w:rPr>
+          <w:noProof/>
+          <w:lang w:val="en-US"/>
+        </w:rPr>
+        <w:drawing>
+          <wp:inline distT="0" distB="0" distL="0" distR="0" wp14:anchorId="7F13024C" wp14:editId="5D6E4E53">
+            <wp:extent cx="4902452" cy="5035809"/>
+            <wp:effectExtent l="0" t="0" r="0" b="0"/>
+            <wp:docPr id="770066704" name="Picture 1" descr="A screenshot of a computer&#10;&#10;AI-generated content may be incorrect."/>
+            <wp:cNvGraphicFramePr>
+              <a:graphicFrameLocks xmlns:a="http://schemas.openxmlformats.org/drawingml/2006/main" noChangeAspect="1"/>
+            </wp:cNvGraphicFramePr>
+            <a:graphic xmlns:a="http://schemas.openxmlformats.org/drawingml/2006/main">
+              <a:graphicData uri="http://schemas.openxmlformats.org/drawingml/2006/picture">
+                <pic:pic xmlns:pic="http://schemas.openxmlformats.org/drawingml/2006/picture">
+                  <pic:nvPicPr>
+                    <pic:cNvPr id="770066704" name="Picture 1" descr="A screenshot of a computer&#10;&#10;AI-generated content may be incorrect."/>
+                    <pic:cNvPicPr/>
+                  </pic:nvPicPr>
+                  <pic:blipFill>
+                    <a:blip r:embed="rId9"/>
+                    <a:stretch>
+                      <a:fillRect/>
+                    </a:stretch>
+                  </pic:blipFill>
+                  <pic:spPr>
+                    <a:xfrm>
+                      <a:off x="0" y="0"/>
+                      <a:ext cx="4902452" cy="5035809"/>
+                    </a:xfrm>
+                    <a:prstGeom prst="rect">
+                      <a:avLst/>
+                    </a:prstGeom>
+                  </pic:spPr>
+                </pic:pic>
+              </a:graphicData>
+            </a:graphic>
+          </wp:inline>
+        </w:drawing>
+      </w:r>
+    </w:p>
+    <w:p>
+      <w:pPr>
+        <w:pStyle w:val="ListParagraph"/>
+        <w:rPr>
+          <w:lang w:val="en-US"/>
+        </w:rPr>
+      </w:pPr>
+      <w:r>
+        <w:rPr>
+          <w:lang w:val="en-US"/>
+        </w:rPr>
+        <w:t>This is to ensure that the totals and margins were set to go for analysis.</w:t>
+      </w:r>
+    </w:p>
+    <w:p>
+      <w:pPr>
+        <w:pStyle w:val="ListParagraph"/>
+        <w:rPr>
+          <w:lang w:val="en-US"/>
+        </w:rPr>
+      </w:pPr>
+    </w:p>
+    <w:p>
+      <w:pPr>
+        <w:pStyle w:val="ListParagraph"/>
+        <w:numPr>
+          <w:ilvl w:val="0"/>
+          <w:numId w:val="7"/>
+        </w:numPr>
+        <w:rPr>
+          <w:lang w:val="en-US"/>
+        </w:rPr>
+      </w:pPr>
+      <w:r>
+        <w:rPr>
+          <w:lang w:val="en-US"/>
+        </w:rPr>
+        <w:lastRenderedPageBreak/>
+        <w:t xml:space="preserve">Connected </w:t>
+      </w:r>
+      <w:proofErr w:type="spellStart"/>
+      <w:r>
+        <w:rPr>
+          <w:lang w:val="en-US"/>
+        </w:rPr>
+        <w:t>PowerBI</w:t>
+      </w:r>
+      <w:proofErr w:type="spellEnd"/>
+      <w:r>
+        <w:rPr>
+          <w:lang w:val="en-US"/>
+        </w:rPr>
+        <w:t xml:space="preserve"> </w:t>
+      </w:r>
+      <w:r>
+        <w:rPr>
+          <w:lang w:val="en-US"/>
+        </w:rPr>
+        <w:t xml:space="preserve">with </w:t>
+      </w:r>
+      <w:r>
+        <w:t>RepositoryDW</w:t>
+      </w:r>
+      <w:r>
+        <w:rPr>
+          <w:lang w:val="en-US"/>
+        </w:rPr>
+        <w:t xml:space="preserve"> and </w:t>
+      </w:r>
+      <w:r>
+        <w:t xml:space="preserve">created </w:t>
+      </w:r>
+      <w:proofErr w:type="gramStart"/>
+      <w:r>
+        <w:t>measures</w:t>
+      </w:r>
+      <w:r>
+        <w:rPr>
+          <w:lang w:val="en-US"/>
+        </w:rPr>
+        <w:t>(</w:t>
+      </w:r>
+      <w:proofErr w:type="gramEnd"/>
+      <w:r>
+        <w:t>TotalAmount, TotalCost,</w:t>
+      </w:r>
+      <w:r>
+        <w:rPr>
+          <w:lang w:val="en-US"/>
+        </w:rPr>
+        <w:t xml:space="preserve"> mar and created a relation between</w:t>
+      </w:r>
+      <w:r>
+        <w:rPr>
+          <w:rFonts w:ascii="Consolas" w:hAnsi="Consolas"/>
+          <w:color w:val="CCCCCC"/>
+          <w:sz w:val="20"/>
+          <w:szCs w:val="20"/>
+          <w:bdr w:val="single" w:sz="2" w:space="0" w:color="auto" w:frame="1"/>
+        </w:rPr>
+        <w:t xml:space="preserve"> </w:t>
+      </w:r>
+      <w:r>
+        <w:t>FactInvoiceHeader/FactInvoicesRow to extractedCustomer</w:t>
+      </w:r>
+      <w:r>
+        <w:t> Margin</w:t>
+      </w:r>
+      <w:r>
+        <w:rPr>
+          <w:lang w:val="en-US"/>
+        </w:rPr>
+        <w:t xml:space="preserve"> t</w:t>
+      </w:r>
+      <w:r>
+        <w:rPr>
+          <w:lang w:val="en-US"/>
+        </w:rPr>
+        <w:t xml:space="preserve">o </w:t>
+      </w:r>
+      <w:r>
+        <w:rPr>
+          <w:lang w:val="en-US"/>
+        </w:rPr>
+        <w:t>which enabled</w:t>
+      </w:r>
+      <w:r>
+        <w:rPr>
+          <w:lang w:val="en-US"/>
+        </w:rPr>
+        <w:t xml:space="preserve"> </w:t>
+      </w:r>
+      <w:r>
+        <w:rPr>
+          <w:lang w:val="en-US"/>
+        </w:rPr>
+        <w:t>Customer Profitability</w:t>
+      </w:r>
+      <w:r>
+        <w:rPr>
+          <w:lang w:val="en-US"/>
+        </w:rPr>
+        <w:t>/margin</w:t>
+      </w:r>
+      <w:r>
+        <w:rPr>
+          <w:lang w:val="en-US"/>
+        </w:rPr>
+        <w:t xml:space="preserve"> analysis</w:t>
+      </w:r>
+      <w:r>
+        <w:rPr>
+          <w:lang w:val="en-US"/>
+        </w:rPr>
+        <w:t>.</w:t>
+      </w:r>
+    </w:p>
+    <w:p>
+      <w:pPr>
+        <w:pStyle w:val="ListParagraph"/>
+        <w:rPr>
+          <w:lang w:val="en-US"/>
+        </w:rPr>
+      </w:pPr>
+      <w:r>
+        <w:rPr>
+          <w:noProof/>
+          <w:lang w:val="en-US"/>
+        </w:rPr>
+        <w:drawing>
+          <wp:inline distT="0" distB="0" distL="0" distR="0" wp14:anchorId="057B7F43" wp14:editId="709C108F">
+            <wp:extent cx="5727700" cy="3270250"/>
+            <wp:effectExtent l="0" t="0" r="6350" b="6350"/>
+            <wp:docPr id="1140703937" name="Picture 1"/>
+            <wp:cNvGraphicFramePr>
+              <a:graphicFrameLocks xmlns:a="http://schemas.openxmlformats.org/drawingml/2006/main" noChangeAspect="1"/>
+            </wp:cNvGraphicFramePr>
+            <a:graphic xmlns:a="http://schemas.openxmlformats.org/drawingml/2006/main">
+              <a:graphicData uri="http://schemas.openxmlformats.org/drawingml/2006/picture">
+                <pic:pic xmlns:pic="http://schemas.openxmlformats.org/drawingml/2006/picture">
+                  <pic:nvPicPr>
+                    <pic:cNvPr id="0" name="Picture 1"/>
+                    <pic:cNvPicPr>
+                      <a:picLocks noChangeAspect="1" noChangeArrowheads="1"/>
+                    </pic:cNvPicPr>
+                  </pic:nvPicPr>
+                  <pic:blipFill>
+                    <a:blip r:embed="rId10">
+                      <a:extLst>
+                        <a:ext uri="{28A0092B-C50C-407E-A947-70E740481C1C}">
+                          <a14:useLocalDpi xmlns:a14="http://schemas.microsoft.com/office/drawing/2010/main" val="0"/>
+                        </a:ext>
+                      </a:extLst>
+                    </a:blip>
+                    <a:srcRect/>
+                    <a:stretch>
+                      <a:fillRect/>
+                    </a:stretch>
+                  </pic:blipFill>
+                  <pic:spPr bwMode="auto">
+                    <a:xfrm>
+                      <a:off x="0" y="0"/>
+                      <a:ext cx="5727700" cy="3270250"/>
+                    </a:xfrm>
+                    <a:prstGeom prst="rect">
+                      <a:avLst/>
+                    </a:prstGeom>
+                    <a:noFill/>
+                    <a:ln>
+                      <a:noFill/>
+                    </a:ln>
+                  </pic:spPr>
+                </pic:pic>
+              </a:graphicData>
+            </a:graphic>
+          </wp:inline>
+        </w:drawing>
+      </w:r>
+    </w:p>
+    <w:p>
+      <w:pPr>
+        <w:ind w:left="720"/>
+      </w:pPr>
+      <w:r>
+        <w:t>This visual highlights which customers generate the highest or lowest profit margins.</w:t>
+      </w:r>
     </w:p>
     <w:p/>
     <w:p/>
     <w:p/>
+    <w:p>
+      <w:pPr>
+        <w:pStyle w:val="Heading2"/>
+      </w:pPr>
+      <w:r>
+        <w:t>Visualization</w:t>
+      </w:r>
+    </w:p>
     <w:p/>
-    <w:p/>
-    <w:p/>
-    <w:p>
-      <w:pPr>
-        <w:pStyle w:val="Heading2"/>
-      </w:pPr>
-      <w:r>
-        <w:t>Visualization</w:t>
-      </w:r>
-    </w:p>
-    <w:p/>
     <w:p>
       <w:pPr>
         <w:pStyle w:val="Heading3"/>
       </w:pPr>
       <w:r>
         <w:lastRenderedPageBreak/>
-        <w:t xml:space="preserve">View 1: </w:t>
-      </w:r>
-      <w:r>
-        <w:t>How much does each country bring from contacts?</w:t>
+        <w:t>View 1: How much does each country bring from contacts?</w:t>
       </w:r>
     </w:p>
     <w:p>
@@ -423,6 +911,9 @@
         <w:ind w:left="360"/>
       </w:pPr>
       <w:r>
+        <w:rPr>
+          <w:noProof/>
+        </w:rPr>
         <w:drawing>
           <wp:inline distT="0" distB="0" distL="0" distR="0" wp14:anchorId="6E1C6FA9" wp14:editId="17FF3153">
             <wp:extent cx="5143500" cy="3663020"/>
@@ -439,7 +930,7 @@
                     <pic:cNvPicPr/>
                   </pic:nvPicPr>
                   <pic:blipFill>
-                    <a:blip r:embed="rId8"/>
+                    <a:blip r:embed="rId11"/>
                     <a:stretch>
                       <a:fillRect/>
                     </a:stretch>
@@ -476,6 +967,9 @@
     </w:p>
     <w:p>
       <w:r>
+        <w:rPr>
+          <w:noProof/>
+        </w:rPr>
         <w:drawing>
           <wp:inline distT="0" distB="0" distL="0" distR="0" wp14:anchorId="75D77AC9" wp14:editId="4FFA338E">
             <wp:extent cx="4775200" cy="3218208"/>
@@ -492,7 +986,7 @@
                     <pic:cNvPicPr/>
                   </pic:nvPicPr>
                   <pic:blipFill>
-                    <a:blip r:embed="rId9"/>
+                    <a:blip r:embed="rId12"/>
                     <a:stretch>
                       <a:fillRect/>
                     </a:stretch>
@@ -529,6 +1023,9 @@
     </w:p>
     <w:p>
       <w:r>
+        <w:rPr>
+          <w:noProof/>
+        </w:rPr>
         <w:drawing>
           <wp:inline distT="0" distB="0" distL="0" distR="0" wp14:anchorId="63B39B9F" wp14:editId="06C22759">
             <wp:extent cx="5731510" cy="2574925"/>
@@ -545,7 +1042,7 @@
                     <pic:cNvPicPr/>
                   </pic:nvPicPr>
                   <pic:blipFill>
-                    <a:blip r:embed="rId10"/>
+                    <a:blip r:embed="rId13"/>
                     <a:stretch>
                       <a:fillRect/>
                     </a:stretch>
@@ -567,13 +1064,43 @@
       </w:r>
     </w:p>
     <w:p>
+      <w:pPr>
+        <w:rPr>
+          <w:lang w:val="en-US"/>
+        </w:rPr>
+      </w:pPr>
       <w:r>
         <w:t>Used SQL view creation script: link</w:t>
       </w:r>
     </w:p>
-    <w:p/>
-    <w:p/>
-    <w:p/>
+    <w:p>
+      <w:pPr>
+        <w:rPr>
+          <w:lang w:val="en-US"/>
+        </w:rPr>
+      </w:pPr>
+    </w:p>
+    <w:p>
+      <w:pPr>
+        <w:rPr>
+          <w:lang w:val="en-US"/>
+        </w:rPr>
+      </w:pPr>
+    </w:p>
+    <w:p>
+      <w:pPr>
+        <w:rPr>
+          <w:lang w:val="en-US"/>
+        </w:rPr>
+      </w:pPr>
+    </w:p>
+    <w:p>
+      <w:pPr>
+        <w:rPr>
+          <w:lang w:val="en-US"/>
+        </w:rPr>
+      </w:pPr>
+    </w:p>
     <w:p>
       <w:pPr>
         <w:pStyle w:val="Heading2"/>
@@ -593,6 +1120,13 @@
       <w:r>
         <w:t>Work Distribution</w:t>
       </w:r>
+    </w:p>
+    <w:p>
+      <w:pPr>
+        <w:rPr>
+          <w:lang w:val="en-US"/>
+        </w:rPr>
+      </w:pPr>
     </w:p>
     <w:sectPr>
       <w:pgSz w:w="11906" w:h="16838"/>
@@ -607,6 +1141,535 @@
 <file path=word/numbering.xml><?xml version="1.0" encoding="utf-8"?>
 <w:numbering xmlns:wpc="http://schemas.microsoft.com/office/word/2010/wordprocessingCanvas" xmlns:cx="http://schemas.microsoft.com/office/drawing/2014/chartex" xmlns:cx1="http://schemas.microsoft.com/office/drawing/2015/9/8/chartex" xmlns:cx2="http://schemas.microsoft.com/office/drawing/2015/10/21/chartex" xmlns:cx3="http://schemas.microsoft.com/office/drawing/2016/5/9/chartex" xmlns:cx4="http://schemas.microsoft.com/office/drawing/2016/5/10/chartex" xmlns:cx5="http://schemas.microsoft.com/office/drawing/2016/5/11/chartex" xmlns:cx6="http://schemas.microsoft.com/office/drawing/2016/5/12/chartex" xmlns:cx7="http://schemas.microsoft.com/office/drawing/2016/5/13/chartex" xmlns:cx8="http://schemas.microsoft.com/office/drawing/2016/5/14/chartex" xmlns:mc="http://schemas.openxmlformats.org/markup-compatibility/2006" xmlns:aink="http://schemas.microsoft.com/office/drawing/2016/ink" xmlns:am3d="http://schemas.microsoft.com/office/drawing/2017/model3d" xmlns:o="urn:schemas-microsoft-com:office:office" xmlns:oel="http://schemas.microsoft.com/office/2019/extlst" xmlns:r="http://schemas.openxmlformats.org/officeDocument/2006/relationships" xmlns:m="http://schemas.openxmlformats.org/officeDocument/2006/math" xmlns:v="urn:schemas-microsoft-com:vml" xmlns:wp14="http://schemas.microsoft.com/office/word/2010/wordprocessingDrawing" xmlns:wp="http://schemas.openxmlformats.org/drawingml/2006/wordprocessingDrawing" xmlns:w10="urn:schemas-microsoft-com:office:word" xmlns:w="http://schemas.openxmlformats.org/wordprocessingml/2006/main" xmlns:w14="http://schemas.microsoft.com/office/word/2010/wordml" xmlns:w15="http://schemas.microsoft.com/office/word/2012/wordml" xmlns:w16cex="http://schemas.microsoft.com/office/word/2018/wordml/cex" xmlns:w16cid="http://schemas.microsoft.com/office/word/2016/wordml/cid" xmlns:w16="http://schemas.microsoft.com/office/word/2018/wordml" xmlns:w16du="http://schemas.microsoft.com/office/word/2023/wordml/word16du" xmlns:w16sdtdh="http://schemas.microsoft.com/office/word/2020/wordml/sdtdatahash" xmlns:w16sdtfl="http://schemas.microsoft.com/office/word/2024/wordml/sdtformatlock" xmlns:w16se="http://schemas.microsoft.com/office/word/2015/wordml/symex" xmlns:wpg="http://schemas.microsoft.com/office/word/2010/wordprocessingGroup" xmlns:wpi="http://schemas.microsoft.com/office/word/2010/wordprocessingInk" xmlns:wne="http://schemas.microsoft.com/office/word/2006/wordml" xmlns:wps="http://schemas.microsoft.com/office/word/2010/wordprocessingShape" mc:Ignorable="w14 w15 w16se w16cid w16 w16cex w16sdtdh w16sdtfl w16du wp14">
   <w:abstractNum w:abstractNumId="0" w15:restartNumberingAfterBreak="0">
+    <w:nsid w:val="07DA5A2B"/>
+    <w:multiLevelType w:val="hybridMultilevel"/>
+    <w:tmpl w:val="853E04E6"/>
+    <w:lvl w:ilvl="0" w:tplc="1000000F">
+      <w:start w:val="3"/>
+      <w:numFmt w:val="decimal"/>
+      <w:lvlText w:val="%1."/>
+      <w:lvlJc w:val="left"/>
+      <w:pPr>
+        <w:ind w:left="720" w:hanging="360"/>
+      </w:pPr>
+      <w:rPr>
+        <w:rFonts w:hint="default"/>
+      </w:rPr>
+    </w:lvl>
+    <w:lvl w:ilvl="1" w:tplc="10000019" w:tentative="1">
+      <w:start w:val="1"/>
+      <w:numFmt w:val="lowerLetter"/>
+      <w:lvlText w:val="%2."/>
+      <w:lvlJc w:val="left"/>
+      <w:pPr>
+        <w:ind w:left="1440" w:hanging="360"/>
+      </w:pPr>
+    </w:lvl>
+    <w:lvl w:ilvl="2" w:tplc="1000001B" w:tentative="1">
+      <w:start w:val="1"/>
+      <w:numFmt w:val="lowerRoman"/>
+      <w:lvlText w:val="%3."/>
+      <w:lvlJc w:val="right"/>
+      <w:pPr>
+        <w:ind w:left="2160" w:hanging="180"/>
+      </w:pPr>
+    </w:lvl>
+    <w:lvl w:ilvl="3" w:tplc="1000000F" w:tentative="1">
+      <w:start w:val="1"/>
+      <w:numFmt w:val="decimal"/>
+      <w:lvlText w:val="%4."/>
+      <w:lvlJc w:val="left"/>
+      <w:pPr>
+        <w:ind w:left="2880" w:hanging="360"/>
+      </w:pPr>
+    </w:lvl>
+    <w:lvl w:ilvl="4" w:tplc="10000019" w:tentative="1">
+      <w:start w:val="1"/>
+      <w:numFmt w:val="lowerLetter"/>
+      <w:lvlText w:val="%5."/>
+      <w:lvlJc w:val="left"/>
+      <w:pPr>
+        <w:ind w:left="3600" w:hanging="360"/>
+      </w:pPr>
+    </w:lvl>
+    <w:lvl w:ilvl="5" w:tplc="1000001B" w:tentative="1">
+      <w:start w:val="1"/>
+      <w:numFmt w:val="lowerRoman"/>
+      <w:lvlText w:val="%6."/>
+      <w:lvlJc w:val="right"/>
+      <w:pPr>
+        <w:ind w:left="4320" w:hanging="180"/>
+      </w:pPr>
+    </w:lvl>
+    <w:lvl w:ilvl="6" w:tplc="1000000F" w:tentative="1">
+      <w:start w:val="1"/>
+      <w:numFmt w:val="decimal"/>
+      <w:lvlText w:val="%7."/>
+      <w:lvlJc w:val="left"/>
+      <w:pPr>
+        <w:ind w:left="5040" w:hanging="360"/>
+      </w:pPr>
+    </w:lvl>
+    <w:lvl w:ilvl="7" w:tplc="10000019" w:tentative="1">
+      <w:start w:val="1"/>
+      <w:numFmt w:val="lowerLetter"/>
+      <w:lvlText w:val="%8."/>
+      <w:lvlJc w:val="left"/>
+      <w:pPr>
+        <w:ind w:left="5760" w:hanging="360"/>
+      </w:pPr>
+    </w:lvl>
+    <w:lvl w:ilvl="8" w:tplc="1000001B" w:tentative="1">
+      <w:start w:val="1"/>
+      <w:numFmt w:val="lowerRoman"/>
+      <w:lvlText w:val="%9."/>
+      <w:lvlJc w:val="right"/>
+      <w:pPr>
+        <w:ind w:left="6480" w:hanging="180"/>
+      </w:pPr>
+    </w:lvl>
+  </w:abstractNum>
+  <w:abstractNum w:abstractNumId="1" w15:restartNumberingAfterBreak="0">
+    <w:nsid w:val="0F8222C0"/>
+    <w:multiLevelType w:val="hybridMultilevel"/>
+    <w:tmpl w:val="AFB89FE6"/>
+    <w:lvl w:ilvl="0" w:tplc="1000000F">
+      <w:start w:val="1"/>
+      <w:numFmt w:val="decimal"/>
+      <w:lvlText w:val="%1."/>
+      <w:lvlJc w:val="left"/>
+      <w:pPr>
+        <w:ind w:left="720" w:hanging="360"/>
+      </w:pPr>
+      <w:rPr>
+        <w:rFonts w:hint="default"/>
+      </w:rPr>
+    </w:lvl>
+    <w:lvl w:ilvl="1" w:tplc="10000019" w:tentative="1">
+      <w:start w:val="1"/>
+      <w:numFmt w:val="lowerLetter"/>
+      <w:lvlText w:val="%2."/>
+      <w:lvlJc w:val="left"/>
+      <w:pPr>
+        <w:ind w:left="1440" w:hanging="360"/>
+      </w:pPr>
+    </w:lvl>
+    <w:lvl w:ilvl="2" w:tplc="1000001B" w:tentative="1">
+      <w:start w:val="1"/>
+      <w:numFmt w:val="lowerRoman"/>
+      <w:lvlText w:val="%3."/>
+      <w:lvlJc w:val="right"/>
+      <w:pPr>
+        <w:ind w:left="2160" w:hanging="180"/>
+      </w:pPr>
+    </w:lvl>
+    <w:lvl w:ilvl="3" w:tplc="1000000F" w:tentative="1">
+      <w:start w:val="1"/>
+      <w:numFmt w:val="decimal"/>
+      <w:lvlText w:val="%4."/>
+      <w:lvlJc w:val="left"/>
+      <w:pPr>
+        <w:ind w:left="2880" w:hanging="360"/>
+      </w:pPr>
+    </w:lvl>
+    <w:lvl w:ilvl="4" w:tplc="10000019" w:tentative="1">
+      <w:start w:val="1"/>
+      <w:numFmt w:val="lowerLetter"/>
+      <w:lvlText w:val="%5."/>
+      <w:lvlJc w:val="left"/>
+      <w:pPr>
+        <w:ind w:left="3600" w:hanging="360"/>
+      </w:pPr>
+    </w:lvl>
+    <w:lvl w:ilvl="5" w:tplc="1000001B" w:tentative="1">
+      <w:start w:val="1"/>
+      <w:numFmt w:val="lowerRoman"/>
+      <w:lvlText w:val="%6."/>
+      <w:lvlJc w:val="right"/>
+      <w:pPr>
+        <w:ind w:left="4320" w:hanging="180"/>
+      </w:pPr>
+    </w:lvl>
+    <w:lvl w:ilvl="6" w:tplc="1000000F" w:tentative="1">
+      <w:start w:val="1"/>
+      <w:numFmt w:val="decimal"/>
+      <w:lvlText w:val="%7."/>
+      <w:lvlJc w:val="left"/>
+      <w:pPr>
+        <w:ind w:left="5040" w:hanging="360"/>
+      </w:pPr>
+    </w:lvl>
+    <w:lvl w:ilvl="7" w:tplc="10000019" w:tentative="1">
+      <w:start w:val="1"/>
+      <w:numFmt w:val="lowerLetter"/>
+      <w:lvlText w:val="%8."/>
+      <w:lvlJc w:val="left"/>
+      <w:pPr>
+        <w:ind w:left="5760" w:hanging="360"/>
+      </w:pPr>
+    </w:lvl>
+    <w:lvl w:ilvl="8" w:tplc="1000001B" w:tentative="1">
+      <w:start w:val="1"/>
+      <w:numFmt w:val="lowerRoman"/>
+      <w:lvlText w:val="%9."/>
+      <w:lvlJc w:val="right"/>
+      <w:pPr>
+        <w:ind w:left="6480" w:hanging="180"/>
+      </w:pPr>
+    </w:lvl>
+  </w:abstractNum>
+  <w:abstractNum w:abstractNumId="2" w15:restartNumberingAfterBreak="0">
+    <w:nsid w:val="22EA1A0D"/>
+    <w:multiLevelType w:val="hybridMultilevel"/>
+    <w:tmpl w:val="50C029EE"/>
+    <w:lvl w:ilvl="0" w:tplc="10000001">
+      <w:start w:val="1"/>
+      <w:numFmt w:val="bullet"/>
+      <w:lvlText w:val=""/>
+      <w:lvlJc w:val="left"/>
+      <w:pPr>
+        <w:ind w:left="720" w:hanging="360"/>
+      </w:pPr>
+      <w:rPr>
+        <w:rFonts w:ascii="Symbol" w:hAnsi="Symbol" w:hint="default"/>
+      </w:rPr>
+    </w:lvl>
+    <w:lvl w:ilvl="1" w:tplc="10000003">
+      <w:start w:val="1"/>
+      <w:numFmt w:val="bullet"/>
+      <w:lvlText w:val="o"/>
+      <w:lvlJc w:val="left"/>
+      <w:pPr>
+        <w:ind w:left="1440" w:hanging="360"/>
+      </w:pPr>
+      <w:rPr>
+        <w:rFonts w:ascii="Courier New" w:hAnsi="Courier New" w:cs="Courier New" w:hint="default"/>
+      </w:rPr>
+    </w:lvl>
+    <w:lvl w:ilvl="2" w:tplc="10000005" w:tentative="1">
+      <w:start w:val="1"/>
+      <w:numFmt w:val="bullet"/>
+      <w:lvlText w:val=""/>
+      <w:lvlJc w:val="left"/>
+      <w:pPr>
+        <w:ind w:left="2160" w:hanging="360"/>
+      </w:pPr>
+      <w:rPr>
+        <w:rFonts w:ascii="Wingdings" w:hAnsi="Wingdings" w:hint="default"/>
+      </w:rPr>
+    </w:lvl>
+    <w:lvl w:ilvl="3" w:tplc="10000001" w:tentative="1">
+      <w:start w:val="1"/>
+      <w:numFmt w:val="bullet"/>
+      <w:lvlText w:val=""/>
+      <w:lvlJc w:val="left"/>
+      <w:pPr>
+        <w:ind w:left="2880" w:hanging="360"/>
+      </w:pPr>
+      <w:rPr>
+        <w:rFonts w:ascii="Symbol" w:hAnsi="Symbol" w:hint="default"/>
+      </w:rPr>
+    </w:lvl>
+    <w:lvl w:ilvl="4" w:tplc="10000003" w:tentative="1">
+      <w:start w:val="1"/>
+      <w:numFmt w:val="bullet"/>
+      <w:lvlText w:val="o"/>
+      <w:lvlJc w:val="left"/>
+      <w:pPr>
+        <w:ind w:left="3600" w:hanging="360"/>
+      </w:pPr>
+      <w:rPr>
+        <w:rFonts w:ascii="Courier New" w:hAnsi="Courier New" w:cs="Courier New" w:hint="default"/>
+      </w:rPr>
+    </w:lvl>
+    <w:lvl w:ilvl="5" w:tplc="10000005" w:tentative="1">
+      <w:start w:val="1"/>
+      <w:numFmt w:val="bullet"/>
+      <w:lvlText w:val=""/>
+      <w:lvlJc w:val="left"/>
+      <w:pPr>
+        <w:ind w:left="4320" w:hanging="360"/>
+      </w:pPr>
+      <w:rPr>
+        <w:rFonts w:ascii="Wingdings" w:hAnsi="Wingdings" w:hint="default"/>
+      </w:rPr>
+    </w:lvl>
+    <w:lvl w:ilvl="6" w:tplc="10000001" w:tentative="1">
+      <w:start w:val="1"/>
+      <w:numFmt w:val="bullet"/>
+      <w:lvlText w:val=""/>
+      <w:lvlJc w:val="left"/>
+      <w:pPr>
+        <w:ind w:left="5040" w:hanging="360"/>
+      </w:pPr>
+      <w:rPr>
+        <w:rFonts w:ascii="Symbol" w:hAnsi="Symbol" w:hint="default"/>
+      </w:rPr>
+    </w:lvl>
+    <w:lvl w:ilvl="7" w:tplc="10000003" w:tentative="1">
+      <w:start w:val="1"/>
+      <w:numFmt w:val="bullet"/>
+      <w:lvlText w:val="o"/>
+      <w:lvlJc w:val="left"/>
+      <w:pPr>
+        <w:ind w:left="5760" w:hanging="360"/>
+      </w:pPr>
+      <w:rPr>
+        <w:rFonts w:ascii="Courier New" w:hAnsi="Courier New" w:cs="Courier New" w:hint="default"/>
+      </w:rPr>
+    </w:lvl>
+    <w:lvl w:ilvl="8" w:tplc="10000005" w:tentative="1">
+      <w:start w:val="1"/>
+      <w:numFmt w:val="bullet"/>
+      <w:lvlText w:val=""/>
+      <w:lvlJc w:val="left"/>
+      <w:pPr>
+        <w:ind w:left="6480" w:hanging="360"/>
+      </w:pPr>
+      <w:rPr>
+        <w:rFonts w:ascii="Wingdings" w:hAnsi="Wingdings" w:hint="default"/>
+      </w:rPr>
+    </w:lvl>
+  </w:abstractNum>
+  <w:abstractNum w:abstractNumId="3" w15:restartNumberingAfterBreak="0">
+    <w:nsid w:val="2A483B1B"/>
+    <w:multiLevelType w:val="hybridMultilevel"/>
+    <w:tmpl w:val="975E65AC"/>
+    <w:lvl w:ilvl="0" w:tplc="03309088">
+      <w:start w:val="1"/>
+      <w:numFmt w:val="decimal"/>
+      <w:lvlText w:val="%1."/>
+      <w:lvlJc w:val="left"/>
+      <w:pPr>
+        <w:ind w:left="720" w:hanging="360"/>
+      </w:pPr>
+      <w:rPr>
+        <w:rFonts w:asciiTheme="minorHAnsi" w:eastAsia="Times New Roman" w:hAnsiTheme="minorHAnsi" w:cs="Times New Roman"/>
+      </w:rPr>
+    </w:lvl>
+    <w:lvl w:ilvl="1" w:tplc="10000019" w:tentative="1">
+      <w:start w:val="1"/>
+      <w:numFmt w:val="lowerLetter"/>
+      <w:lvlText w:val="%2."/>
+      <w:lvlJc w:val="left"/>
+      <w:pPr>
+        <w:ind w:left="1440" w:hanging="360"/>
+      </w:pPr>
+    </w:lvl>
+    <w:lvl w:ilvl="2" w:tplc="1000001B" w:tentative="1">
+      <w:start w:val="1"/>
+      <w:numFmt w:val="lowerRoman"/>
+      <w:lvlText w:val="%3."/>
+      <w:lvlJc w:val="right"/>
+      <w:pPr>
+        <w:ind w:left="2160" w:hanging="180"/>
+      </w:pPr>
+    </w:lvl>
+    <w:lvl w:ilvl="3" w:tplc="1000000F" w:tentative="1">
+      <w:start w:val="1"/>
+      <w:numFmt w:val="decimal"/>
+      <w:lvlText w:val="%4."/>
+      <w:lvlJc w:val="left"/>
+      <w:pPr>
+        <w:ind w:left="2880" w:hanging="360"/>
+      </w:pPr>
+    </w:lvl>
+    <w:lvl w:ilvl="4" w:tplc="10000019" w:tentative="1">
+      <w:start w:val="1"/>
+      <w:numFmt w:val="lowerLetter"/>
+      <w:lvlText w:val="%5."/>
+      <w:lvlJc w:val="left"/>
+      <w:pPr>
+        <w:ind w:left="3600" w:hanging="360"/>
+      </w:pPr>
+    </w:lvl>
+    <w:lvl w:ilvl="5" w:tplc="1000001B" w:tentative="1">
+      <w:start w:val="1"/>
+      <w:numFmt w:val="lowerRoman"/>
+      <w:lvlText w:val="%6."/>
+      <w:lvlJc w:val="right"/>
+      <w:pPr>
+        <w:ind w:left="4320" w:hanging="180"/>
+      </w:pPr>
+    </w:lvl>
+    <w:lvl w:ilvl="6" w:tplc="1000000F" w:tentative="1">
+      <w:start w:val="1"/>
+      <w:numFmt w:val="decimal"/>
+      <w:lvlText w:val="%7."/>
+      <w:lvlJc w:val="left"/>
+      <w:pPr>
+        <w:ind w:left="5040" w:hanging="360"/>
+      </w:pPr>
+    </w:lvl>
+    <w:lvl w:ilvl="7" w:tplc="10000019" w:tentative="1">
+      <w:start w:val="1"/>
+      <w:numFmt w:val="lowerLetter"/>
+      <w:lvlText w:val="%8."/>
+      <w:lvlJc w:val="left"/>
+      <w:pPr>
+        <w:ind w:left="5760" w:hanging="360"/>
+      </w:pPr>
+    </w:lvl>
+    <w:lvl w:ilvl="8" w:tplc="1000001B" w:tentative="1">
+      <w:start w:val="1"/>
+      <w:numFmt w:val="lowerRoman"/>
+      <w:lvlText w:val="%9."/>
+      <w:lvlJc w:val="right"/>
+      <w:pPr>
+        <w:ind w:left="6480" w:hanging="180"/>
+      </w:pPr>
+    </w:lvl>
+  </w:abstractNum>
+  <w:abstractNum w:abstractNumId="4" w15:restartNumberingAfterBreak="0">
+    <w:nsid w:val="3055757A"/>
+    <w:multiLevelType w:val="multilevel"/>
+    <w:tmpl w:val="19A4136E"/>
+    <w:lvl w:ilvl="0">
+      <w:start w:val="1"/>
+      <w:numFmt w:val="bullet"/>
+      <w:lvlText w:val=""/>
+      <w:lvlJc w:val="left"/>
+      <w:pPr>
+        <w:tabs>
+          <w:tab w:val="num" w:pos="720"/>
+        </w:tabs>
+        <w:ind w:left="720" w:hanging="360"/>
+      </w:pPr>
+      <w:rPr>
+        <w:rFonts w:ascii="Symbol" w:hAnsi="Symbol" w:hint="default"/>
+        <w:sz w:val="20"/>
+      </w:rPr>
+    </w:lvl>
+    <w:lvl w:ilvl="1" w:tentative="1">
+      <w:start w:val="1"/>
+      <w:numFmt w:val="bullet"/>
+      <w:lvlText w:val="o"/>
+      <w:lvlJc w:val="left"/>
+      <w:pPr>
+        <w:tabs>
+          <w:tab w:val="num" w:pos="1440"/>
+        </w:tabs>
+        <w:ind w:left="1440" w:hanging="360"/>
+      </w:pPr>
+      <w:rPr>
+        <w:rFonts w:ascii="Courier New" w:hAnsi="Courier New" w:hint="default"/>
+        <w:sz w:val="20"/>
+      </w:rPr>
+    </w:lvl>
+    <w:lvl w:ilvl="2" w:tentative="1">
+      <w:start w:val="1"/>
+      <w:numFmt w:val="bullet"/>
+      <w:lvlText w:val=""/>
+      <w:lvlJc w:val="left"/>
+      <w:pPr>
+        <w:tabs>
+          <w:tab w:val="num" w:pos="2160"/>
+        </w:tabs>
+        <w:ind w:left="2160" w:hanging="360"/>
+      </w:pPr>
+      <w:rPr>
+        <w:rFonts w:ascii="Wingdings" w:hAnsi="Wingdings" w:hint="default"/>
+        <w:sz w:val="20"/>
+      </w:rPr>
+    </w:lvl>
+    <w:lvl w:ilvl="3" w:tentative="1">
+      <w:start w:val="1"/>
+      <w:numFmt w:val="bullet"/>
+      <w:lvlText w:val=""/>
+      <w:lvlJc w:val="left"/>
+      <w:pPr>
+        <w:tabs>
+          <w:tab w:val="num" w:pos="2880"/>
+        </w:tabs>
+        <w:ind w:left="2880" w:hanging="360"/>
+      </w:pPr>
+      <w:rPr>
+        <w:rFonts w:ascii="Wingdings" w:hAnsi="Wingdings" w:hint="default"/>
+        <w:sz w:val="20"/>
+      </w:rPr>
+    </w:lvl>
+    <w:lvl w:ilvl="4" w:tentative="1">
+      <w:start w:val="1"/>
+      <w:numFmt w:val="bullet"/>
+      <w:lvlText w:val=""/>
+      <w:lvlJc w:val="left"/>
+      <w:pPr>
+        <w:tabs>
+          <w:tab w:val="num" w:pos="3600"/>
+        </w:tabs>
+        <w:ind w:left="3600" w:hanging="360"/>
+      </w:pPr>
+      <w:rPr>
+        <w:rFonts w:ascii="Wingdings" w:hAnsi="Wingdings" w:hint="default"/>
+        <w:sz w:val="20"/>
+      </w:rPr>
+    </w:lvl>
+    <w:lvl w:ilvl="5" w:tentative="1">
+      <w:start w:val="1"/>
+      <w:numFmt w:val="bullet"/>
+      <w:lvlText w:val=""/>
+      <w:lvlJc w:val="left"/>
+      <w:pPr>
+        <w:tabs>
+          <w:tab w:val="num" w:pos="4320"/>
+        </w:tabs>
+        <w:ind w:left="4320" w:hanging="360"/>
+      </w:pPr>
+      <w:rPr>
+        <w:rFonts w:ascii="Wingdings" w:hAnsi="Wingdings" w:hint="default"/>
+        <w:sz w:val="20"/>
+      </w:rPr>
+    </w:lvl>
+    <w:lvl w:ilvl="6" w:tentative="1">
+      <w:start w:val="1"/>
+      <w:numFmt w:val="bullet"/>
+      <w:lvlText w:val=""/>
+      <w:lvlJc w:val="left"/>
+      <w:pPr>
+        <w:tabs>
+          <w:tab w:val="num" w:pos="5040"/>
+        </w:tabs>
+        <w:ind w:left="5040" w:hanging="360"/>
+      </w:pPr>
+      <w:rPr>
+        <w:rFonts w:ascii="Wingdings" w:hAnsi="Wingdings" w:hint="default"/>
+        <w:sz w:val="20"/>
+      </w:rPr>
+    </w:lvl>
+    <w:lvl w:ilvl="7" w:tentative="1">
+      <w:start w:val="1"/>
+      <w:numFmt w:val="bullet"/>
+      <w:lvlText w:val=""/>
+      <w:lvlJc w:val="left"/>
+      <w:pPr>
+        <w:tabs>
+          <w:tab w:val="num" w:pos="5760"/>
+        </w:tabs>
+        <w:ind w:left="5760" w:hanging="360"/>
+      </w:pPr>
+      <w:rPr>
+        <w:rFonts w:ascii="Wingdings" w:hAnsi="Wingdings" w:hint="default"/>
+        <w:sz w:val="20"/>
+      </w:rPr>
+    </w:lvl>
+    <w:lvl w:ilvl="8" w:tentative="1">
+      <w:start w:val="1"/>
+      <w:numFmt w:val="bullet"/>
+      <w:lvlText w:val=""/>
+      <w:lvlJc w:val="left"/>
+      <w:pPr>
+        <w:tabs>
+          <w:tab w:val="num" w:pos="6480"/>
+        </w:tabs>
+        <w:ind w:left="6480" w:hanging="360"/>
+      </w:pPr>
+      <w:rPr>
+        <w:rFonts w:ascii="Wingdings" w:hAnsi="Wingdings" w:hint="default"/>
+        <w:sz w:val="20"/>
+      </w:rPr>
+    </w:lvl>
+  </w:abstractNum>
+  <w:abstractNum w:abstractNumId="5" w15:restartNumberingAfterBreak="0">
     <w:nsid w:val="635B6D5E"/>
     <w:multiLevelType w:val="hybridMultilevel"/>
     <w:tmpl w:val="EADCAE80"/>
@@ -695,7 +1758,142 @@
       </w:pPr>
     </w:lvl>
   </w:abstractNum>
+  <w:abstractNum w:abstractNumId="6" w15:restartNumberingAfterBreak="0">
+    <w:nsid w:val="651948D3"/>
+    <w:multiLevelType w:val="multilevel"/>
+    <w:tmpl w:val="13E6AA5E"/>
+    <w:lvl w:ilvl="0">
+      <w:start w:val="1"/>
+      <w:numFmt w:val="decimal"/>
+      <w:lvlText w:val="%1."/>
+      <w:lvlJc w:val="left"/>
+      <w:pPr>
+        <w:tabs>
+          <w:tab w:val="num" w:pos="720"/>
+        </w:tabs>
+        <w:ind w:left="720" w:hanging="360"/>
+      </w:pPr>
+    </w:lvl>
+    <w:lvl w:ilvl="1">
+      <w:start w:val="1"/>
+      <w:numFmt w:val="bullet"/>
+      <w:lvlText w:val=""/>
+      <w:lvlJc w:val="left"/>
+      <w:pPr>
+        <w:tabs>
+          <w:tab w:val="num" w:pos="1440"/>
+        </w:tabs>
+        <w:ind w:left="1440" w:hanging="360"/>
+      </w:pPr>
+      <w:rPr>
+        <w:rFonts w:ascii="Symbol" w:hAnsi="Symbol" w:hint="default"/>
+        <w:sz w:val="20"/>
+      </w:rPr>
+    </w:lvl>
+    <w:lvl w:ilvl="2" w:tentative="1">
+      <w:start w:val="1"/>
+      <w:numFmt w:val="decimal"/>
+      <w:lvlText w:val="%3."/>
+      <w:lvlJc w:val="left"/>
+      <w:pPr>
+        <w:tabs>
+          <w:tab w:val="num" w:pos="2160"/>
+        </w:tabs>
+        <w:ind w:left="2160" w:hanging="360"/>
+      </w:pPr>
+    </w:lvl>
+    <w:lvl w:ilvl="3" w:tentative="1">
+      <w:start w:val="1"/>
+      <w:numFmt w:val="decimal"/>
+      <w:lvlText w:val="%4."/>
+      <w:lvlJc w:val="left"/>
+      <w:pPr>
+        <w:tabs>
+          <w:tab w:val="num" w:pos="2880"/>
+        </w:tabs>
+        <w:ind w:left="2880" w:hanging="360"/>
+      </w:pPr>
+    </w:lvl>
+    <w:lvl w:ilvl="4" w:tentative="1">
+      <w:start w:val="1"/>
+      <w:numFmt w:val="decimal"/>
+      <w:lvlText w:val="%5."/>
+      <w:lvlJc w:val="left"/>
+      <w:pPr>
+        <w:tabs>
+          <w:tab w:val="num" w:pos="3600"/>
+        </w:tabs>
+        <w:ind w:left="3600" w:hanging="360"/>
+      </w:pPr>
+    </w:lvl>
+    <w:lvl w:ilvl="5" w:tentative="1">
+      <w:start w:val="1"/>
+      <w:numFmt w:val="decimal"/>
+      <w:lvlText w:val="%6."/>
+      <w:lvlJc w:val="left"/>
+      <w:pPr>
+        <w:tabs>
+          <w:tab w:val="num" w:pos="4320"/>
+        </w:tabs>
+        <w:ind w:left="4320" w:hanging="360"/>
+      </w:pPr>
+    </w:lvl>
+    <w:lvl w:ilvl="6" w:tentative="1">
+      <w:start w:val="1"/>
+      <w:numFmt w:val="decimal"/>
+      <w:lvlText w:val="%7."/>
+      <w:lvlJc w:val="left"/>
+      <w:pPr>
+        <w:tabs>
+          <w:tab w:val="num" w:pos="5040"/>
+        </w:tabs>
+        <w:ind w:left="5040" w:hanging="360"/>
+      </w:pPr>
+    </w:lvl>
+    <w:lvl w:ilvl="7" w:tentative="1">
+      <w:start w:val="1"/>
+      <w:numFmt w:val="decimal"/>
+      <w:lvlText w:val="%8."/>
+      <w:lvlJc w:val="left"/>
+      <w:pPr>
+        <w:tabs>
+          <w:tab w:val="num" w:pos="5760"/>
+        </w:tabs>
+        <w:ind w:left="5760" w:hanging="360"/>
+      </w:pPr>
+    </w:lvl>
+    <w:lvl w:ilvl="8" w:tentative="1">
+      <w:start w:val="1"/>
+      <w:numFmt w:val="decimal"/>
+      <w:lvlText w:val="%9."/>
+      <w:lvlJc w:val="left"/>
+      <w:pPr>
+        <w:tabs>
+          <w:tab w:val="num" w:pos="6480"/>
+        </w:tabs>
+        <w:ind w:left="6480" w:hanging="360"/>
+      </w:pPr>
+    </w:lvl>
+  </w:abstractNum>
   <w:num w:numId="1" w16cid:durableId="1614940446">
+    <w:abstractNumId w:val="5"/>
+  </w:num>
+  <w:num w:numId="2" w16cid:durableId="60835492">
+    <w:abstractNumId w:val="1"/>
+  </w:num>
+  <w:num w:numId="3" w16cid:durableId="1049190550">
+    <w:abstractNumId w:val="6"/>
+  </w:num>
+  <w:num w:numId="4" w16cid:durableId="1205019862">
+    <w:abstractNumId w:val="3"/>
+  </w:num>
+  <w:num w:numId="5" w16cid:durableId="1767730280">
+    <w:abstractNumId w:val="2"/>
+  </w:num>
+  <w:num w:numId="6" w16cid:durableId="1522208403">
+    <w:abstractNumId w:val="4"/>
+  </w:num>
+  <w:num w:numId="7" w16cid:durableId="2009361847">
     <w:abstractNumId w:val="0"/>
   </w:num>
 </w:numbering>
@@ -710,7 +1908,7 @@
         <w:kern w:val="2"/>
         <w:sz w:val="24"/>
         <w:szCs w:val="24"/>
-        <w:lang w:val="en-FI" w:eastAsia="en-US" w:bidi="ar-SA"/>
+        <w:lang w:eastAsia="en-US" w:bidi="ar-SA"/>
         <w14:ligatures w14:val="standardContextual"/>
       </w:rPr>
     </w:rPrDefault>
@@ -1613,6 +2811,46 @@
       <w:spacing w:val="5"/>
     </w:rPr>
   </w:style>
+  <w:style w:type="paragraph" w:styleId="NormalWeb">
+    <w:name w:val="Normal (Web)"/>
+    <w:basedOn w:val="Normal"/>
+    <w:uiPriority w:val="99"/>
+    <w:semiHidden/>
+    <w:unhideWhenUsed/>
+    <w:rsid w:val="00DB6B7A"/>
+    <w:pPr>
+      <w:spacing w:before="100" w:beforeAutospacing="1" w:after="100" w:afterAutospacing="1" w:line="240" w:lineRule="auto"/>
+    </w:pPr>
+    <w:rPr>
+      <w:rFonts w:ascii="Times New Roman" w:eastAsia="Times New Roman" w:hAnsi="Times New Roman" w:cs="Times New Roman"/>
+      <w:kern w:val="0"/>
+      <w14:ligatures w14:val="none"/>
+    </w:rPr>
+  </w:style>
+  <w:style w:type="character" w:styleId="Strong">
+    <w:name w:val="Strong"/>
+    <w:basedOn w:val="DefaultParagraphFont"/>
+    <w:uiPriority w:val="22"/>
+    <w:qFormat/>
+    <w:rsid w:val="00DB6B7A"/>
+    <w:rPr>
+      <w:b/>
+      <w:bCs/>
+    </w:rPr>
+  </w:style>
+  <w:style w:type="character" w:styleId="HTMLCode">
+    <w:name w:val="HTML Code"/>
+    <w:basedOn w:val="DefaultParagraphFont"/>
+    <w:uiPriority w:val="99"/>
+    <w:semiHidden/>
+    <w:unhideWhenUsed/>
+    <w:rsid w:val="00DB6B7A"/>
+    <w:rPr>
+      <w:rFonts w:ascii="Courier New" w:eastAsia="Times New Roman" w:hAnsi="Courier New" w:cs="Courier New"/>
+      <w:sz w:val="20"/>
+      <w:szCs w:val="20"/>
+    </w:rPr>
+  </w:style>
 </w:styles>
 </file>
 

</xml_diff>